<commit_message>
Add API Endpoint Plan with 17 endpoints
</commit_message>
<xml_diff>
--- a/docs/PROG6212 POE PART1.docx
+++ b/docs/PROG6212 POE PART1.docx
@@ -20,6 +20,7 @@
         <w:tc>
           <w:tcPr>
             <w:tcW w:w="1502" w:type="dxa"/>
+            <w:shd w:val="clear" w:color="auto" w:fill="0E2841" w:themeFill="text2"/>
           </w:tcPr>
           <w:p>
             <w:r>
@@ -30,6 +31,7 @@
         <w:tc>
           <w:tcPr>
             <w:tcW w:w="1502" w:type="dxa"/>
+            <w:shd w:val="clear" w:color="auto" w:fill="0E2841" w:themeFill="text2"/>
           </w:tcPr>
           <w:p>
             <w:r>
@@ -40,6 +42,7 @@
         <w:tc>
           <w:tcPr>
             <w:tcW w:w="1503" w:type="dxa"/>
+            <w:shd w:val="clear" w:color="auto" w:fill="0E2841" w:themeFill="text2"/>
           </w:tcPr>
           <w:p>
             <w:r>
@@ -50,6 +53,7 @@
         <w:tc>
           <w:tcPr>
             <w:tcW w:w="1503" w:type="dxa"/>
+            <w:shd w:val="clear" w:color="auto" w:fill="0E2841" w:themeFill="text2"/>
           </w:tcPr>
           <w:p>
             <w:r>
@@ -60,6 +64,7 @@
         <w:tc>
           <w:tcPr>
             <w:tcW w:w="1503" w:type="dxa"/>
+            <w:shd w:val="clear" w:color="auto" w:fill="0E2841" w:themeFill="text2"/>
           </w:tcPr>
           <w:p>
             <w:r>
@@ -70,6 +75,7 @@
         <w:tc>
           <w:tcPr>
             <w:tcW w:w="1503" w:type="dxa"/>
+            <w:shd w:val="clear" w:color="auto" w:fill="0E2841" w:themeFill="text2"/>
           </w:tcPr>
           <w:p>
             <w:r>
@@ -1060,6 +1066,7 @@
           </w:tcPr>
           <w:p>
             <w:r>
+              <w:lastRenderedPageBreak/>
               <w:t>PUT</w:t>
             </w:r>
           </w:p>
@@ -2394,6 +2401,9 @@
     </w:p>
     <w:p>
       <w:r>
+        <w:rPr>
+          <w:noProof/>
+        </w:rPr>
         <w:drawing>
           <wp:inline distT="0" distB="0" distL="0" distR="0" wp14:anchorId="2779EE97" wp14:editId="41F196A6">
             <wp:extent cx="5731510" cy="1477645"/>
@@ -2555,6 +2565,9 @@
     </w:p>
     <w:p>
       <w:r>
+        <w:rPr>
+          <w:noProof/>
+        </w:rPr>
         <w:drawing>
           <wp:inline distT="0" distB="0" distL="0" distR="0" wp14:anchorId="68628547" wp14:editId="0BDDEBE3">
             <wp:extent cx="5731510" cy="1546225"/>
@@ -2881,6 +2894,9 @@
     </w:p>
     <w:p>
       <w:r>
+        <w:rPr>
+          <w:noProof/>
+        </w:rPr>
         <w:drawing>
           <wp:inline distT="0" distB="0" distL="0" distR="0" wp14:anchorId="6D9F905D" wp14:editId="4C4FFFB4">
             <wp:extent cx="5731510" cy="1471930"/>
@@ -3184,6 +3200,9 @@
     </w:p>
     <w:p>
       <w:r>
+        <w:rPr>
+          <w:noProof/>
+        </w:rPr>
         <w:drawing>
           <wp:inline distT="0" distB="0" distL="0" distR="0" wp14:anchorId="0AFAF4F5" wp14:editId="1C787180">
             <wp:extent cx="5731510" cy="1393825"/>
@@ -3366,6 +3385,9 @@
     </w:p>
     <w:p>
       <w:r>
+        <w:rPr>
+          <w:noProof/>
+        </w:rPr>
         <w:drawing>
           <wp:inline distT="0" distB="0" distL="0" distR="0" wp14:anchorId="08E832A3" wp14:editId="5D5612C5">
             <wp:extent cx="5731510" cy="1489710"/>
@@ -3631,6 +3653,9 @@
     </w:p>
     <w:p>
       <w:r>
+        <w:rPr>
+          <w:noProof/>
+        </w:rPr>
         <w:drawing>
           <wp:inline distT="0" distB="0" distL="0" distR="0" wp14:anchorId="270B584D" wp14:editId="65DAB21C">
             <wp:extent cx="5731510" cy="1414780"/>
@@ -3973,6 +3998,9 @@
     </w:p>
     <w:p>
       <w:r>
+        <w:rPr>
+          <w:noProof/>
+        </w:rPr>
         <w:drawing>
           <wp:inline distT="0" distB="0" distL="0" distR="0" wp14:anchorId="5F2CF59E" wp14:editId="4ED95CC8">
             <wp:extent cx="5731510" cy="1459865"/>
@@ -4211,6 +4239,9 @@
     </w:p>
     <w:p>
       <w:r>
+        <w:rPr>
+          <w:noProof/>
+        </w:rPr>
         <w:drawing>
           <wp:inline distT="0" distB="0" distL="0" distR="0" wp14:anchorId="077C0365" wp14:editId="71DEBA01">
             <wp:extent cx="5731510" cy="1414780"/>
@@ -4328,6 +4359,9 @@
     </w:p>
     <w:p>
       <w:r>
+        <w:rPr>
+          <w:noProof/>
+        </w:rPr>
         <w:drawing>
           <wp:inline distT="0" distB="0" distL="0" distR="0" wp14:anchorId="523C0EEB" wp14:editId="53496EC2">
             <wp:extent cx="5731510" cy="1474470"/>
@@ -4522,6 +4556,9 @@
     </w:p>
     <w:p>
       <w:r>
+        <w:rPr>
+          <w:noProof/>
+        </w:rPr>
         <w:drawing>
           <wp:inline distT="0" distB="0" distL="0" distR="0" wp14:anchorId="36540301" wp14:editId="2146385E">
             <wp:extent cx="5731510" cy="1468755"/>
@@ -4751,6 +4788,9 @@
     </w:p>
     <w:p>
       <w:r>
+        <w:rPr>
+          <w:noProof/>
+        </w:rPr>
         <w:drawing>
           <wp:inline distT="0" distB="0" distL="0" distR="0" wp14:anchorId="25318034" wp14:editId="7A7D46F7">
             <wp:extent cx="5731510" cy="1423670"/>
@@ -5087,6 +5127,9 @@
     </w:p>
     <w:p>
       <w:r>
+        <w:rPr>
+          <w:noProof/>
+        </w:rPr>
         <w:drawing>
           <wp:inline distT="0" distB="0" distL="0" distR="0" wp14:anchorId="5E7D07B9" wp14:editId="327B5DEB">
             <wp:extent cx="5731510" cy="1474470"/>
@@ -5364,6 +5407,9 @@
     </w:p>
     <w:p>
       <w:r>
+        <w:rPr>
+          <w:noProof/>
+        </w:rPr>
         <w:drawing>
           <wp:inline distT="0" distB="0" distL="0" distR="0" wp14:anchorId="15699D62" wp14:editId="3C136249">
             <wp:extent cx="5731510" cy="1465580"/>
@@ -6420,6 +6466,9 @@
     </w:p>
     <w:p>
       <w:r>
+        <w:rPr>
+          <w:noProof/>
+        </w:rPr>
         <w:lastRenderedPageBreak/>
         <w:drawing>
           <wp:inline distT="0" distB="0" distL="0" distR="0" wp14:anchorId="60A0A557" wp14:editId="4857B2F2">
@@ -6727,6 +6776,9 @@
     </w:p>
     <w:p>
       <w:r>
+        <w:rPr>
+          <w:noProof/>
+        </w:rPr>
         <w:drawing>
           <wp:inline distT="0" distB="0" distL="0" distR="0" wp14:anchorId="164BE013" wp14:editId="1D7E2876">
             <wp:extent cx="5731510" cy="1635760"/>
@@ -6902,6 +6954,9 @@
     </w:p>
     <w:p>
       <w:r>
+        <w:rPr>
+          <w:noProof/>
+        </w:rPr>
         <w:drawing>
           <wp:inline distT="0" distB="0" distL="0" distR="0" wp14:anchorId="729228C1" wp14:editId="38CBE729">
             <wp:extent cx="5731510" cy="1617980"/>
@@ -7049,6 +7104,9 @@
     </w:p>
     <w:p>
       <w:r>
+        <w:rPr>
+          <w:noProof/>
+        </w:rPr>
         <w:drawing>
           <wp:inline distT="0" distB="0" distL="0" distR="0" wp14:anchorId="32B86E56" wp14:editId="0995F21B">
             <wp:extent cx="5731510" cy="1450975"/>
@@ -7174,6 +7232,9 @@
     </w:p>
     <w:p>
       <w:r>
+        <w:rPr>
+          <w:noProof/>
+        </w:rPr>
         <w:drawing>
           <wp:inline distT="0" distB="0" distL="0" distR="0" wp14:anchorId="290F5DB6" wp14:editId="4692E4DA">
             <wp:extent cx="5731510" cy="1430020"/>
@@ -7549,6 +7610,9 @@
     </w:p>
     <w:p>
       <w:r>
+        <w:rPr>
+          <w:noProof/>
+        </w:rPr>
         <w:drawing>
           <wp:inline distT="0" distB="0" distL="0" distR="0" wp14:anchorId="768508D6" wp14:editId="2E5A9950">
             <wp:extent cx="5731510" cy="1477645"/>
@@ -7946,6 +8010,9 @@
     </w:p>
     <w:p>
       <w:r>
+        <w:rPr>
+          <w:noProof/>
+        </w:rPr>
         <w:drawing>
           <wp:inline distT="0" distB="0" distL="0" distR="0" wp14:anchorId="581AE5A2" wp14:editId="0358130F">
             <wp:extent cx="5731510" cy="1453515"/>
@@ -7986,6 +8053,9 @@
     <w:p/>
     <w:p>
       <w:r>
+        <w:rPr>
+          <w:noProof/>
+        </w:rPr>
         <w:drawing>
           <wp:inline distT="0" distB="0" distL="0" distR="0" wp14:anchorId="6F3FC810" wp14:editId="318F5F7E">
             <wp:extent cx="5731510" cy="1450975"/>
@@ -8023,6 +8093,9 @@
         </w:drawing>
       </w:r>
       <w:r>
+        <w:rPr>
+          <w:noProof/>
+        </w:rPr>
         <w:drawing>
           <wp:inline distT="0" distB="0" distL="0" distR="0" wp14:anchorId="222F3AB3" wp14:editId="04F78B23">
             <wp:extent cx="5731510" cy="1423670"/>
@@ -8692,6 +8765,7 @@
   <w:style w:type="character" w:default="1" w:styleId="DefaultParagraphFont">
     <w:name w:val="Default Paragraph Font"/>
     <w:uiPriority w:val="1"/>
+    <w:semiHidden/>
     <w:unhideWhenUsed/>
   </w:style>
   <w:style w:type="table" w:default="1" w:styleId="TableNormal">

</xml_diff>